<commit_message>
refactor(copy): establish neutral professional positioning across resume and site copy
</commit_message>
<xml_diff>
--- a/assets/Ahmed_Hannan_Resume.docx
+++ b/assets/Ahmed_Hannan_Resume.docx
@@ -54,12 +54,7 @@
         <w:spacing w:before="20" w:after="30" w:line="252" w:lineRule="auto"/>
       </w:pPr>
       <w:r>
-        <w:rPr>
-          <w:rFonts w:ascii="Arial" w:hAnsi="Arial"/>
-          <w:color w:val="334155"/>
-          <w:sz w:val="18"/>
-        </w:rPr>
-        <w:t>Software Engineer and Computer Science graduate (FAST-NUCES) with a proven record of shipping concurrent, production web and mobile platforms alongside cutting-edge research in Multimodal Generative AI and High-Performance Computing. At EmpowerBits, engineered production web and mobile apps (iOS &amp; Android) actively supporting concurrent users, earning an executive Certificate of Excellence / Performance Award. Experienced in building end-to-end multimodal RAG pipelines (CLIP, FAISS, Gemma 3), GPU-accelerated computing (CUDA, Tensor Cores), distributed graph algorithms (OpenMP, MPI), and cloud analytics (Google BigQuery). Demonstrates strong architectural ownership spanning full-stack application development, systems engineering, and applied AI research.</w:t>
+        <w:t>Software Engineer and Computer Scientist (FAST-NUCES) with a proven record of shipping concurrent, production web and mobile platforms alongside cutting-edge research in Multimodal Generative AI and High-Performance Computing. At EmpowerBits, engineered production web and mobile apps (iOS &amp; Android) actively supporting concurrent users, earning an executive Certificate of Excellence / Performance Award. Experienced in building end-to-end multimodal RAG pipelines (CLIP, FAISS, Gemma 3), GPU-accelerated computing (CUDA, Tensor Cores), distributed graph algorithms (OpenMP, MPI), and cloud analytics (Google BigQuery). Demonstrates strong architectural ownership spanning full-stack application development, systems engineering, and applied AI research.</w:t>
       </w:r>
     </w:p>
     <w:p>

</xml_diff>